<commit_message>
Add load, stress, and performance testing skills
Include Load Testing, Stress Testing, and Performance Testing in the
skills section across HTML, Word, and PDF resume exports.

Co-authored-by: Gulraiz Ahmed <GulraizAhmed@users.noreply.github.com>
</commit_message>
<xml_diff>
--- a/Sadia_Ghafoor_Resume.docx
+++ b/Sadia_Ghafoor_Resume.docx
@@ -1179,6 +1179,66 @@
               </w:rPr>
               <w:t>Test Case Design</w:t>
             </w:r>
+            <w:r>
+              <w:rPr>
+                <w:rFonts w:ascii="Calibri" w:hAnsi="Calibri" w:eastAsia="Calibri"/>
+                <w:b w:val="0"/>
+                <w:i w:val="0"/>
+                <w:color w:val="AAAAAA"/>
+                <w:sz w:val="18"/>
+              </w:rPr>
+              <w:t xml:space="preserve">  •  </w:t>
+            </w:r>
+            <w:r>
+              <w:rPr>
+                <w:rFonts w:ascii="Calibri" w:hAnsi="Calibri" w:eastAsia="Calibri"/>
+                <w:b/>
+                <w:i w:val="0"/>
+                <w:color w:val="555555"/>
+                <w:sz w:val="18"/>
+              </w:rPr>
+              <w:t>Load Testing</w:t>
+            </w:r>
+            <w:r>
+              <w:rPr>
+                <w:rFonts w:ascii="Calibri" w:hAnsi="Calibri" w:eastAsia="Calibri"/>
+                <w:b w:val="0"/>
+                <w:i w:val="0"/>
+                <w:color w:val="AAAAAA"/>
+                <w:sz w:val="18"/>
+              </w:rPr>
+              <w:t xml:space="preserve">  •  </w:t>
+            </w:r>
+            <w:r>
+              <w:rPr>
+                <w:rFonts w:ascii="Calibri" w:hAnsi="Calibri" w:eastAsia="Calibri"/>
+                <w:b/>
+                <w:i w:val="0"/>
+                <w:color w:val="555555"/>
+                <w:sz w:val="18"/>
+              </w:rPr>
+              <w:t>Stress Testing</w:t>
+            </w:r>
+            <w:r>
+              <w:rPr>
+                <w:rFonts w:ascii="Calibri" w:hAnsi="Calibri" w:eastAsia="Calibri"/>
+                <w:b w:val="0"/>
+                <w:i w:val="0"/>
+                <w:color w:val="AAAAAA"/>
+                <w:sz w:val="18"/>
+              </w:rPr>
+              <w:t xml:space="preserve">  •  </w:t>
+            </w:r>
+            <w:r>
+              <w:rPr>
+                <w:rFonts w:ascii="Calibri" w:hAnsi="Calibri" w:eastAsia="Calibri"/>
+                <w:b/>
+                <w:i w:val="0"/>
+                <w:color w:val="555555"/>
+                <w:sz w:val="18"/>
+              </w:rPr>
+              <w:t>Performance Testing</w:t>
+            </w:r>
           </w:p>
           <w:p>
             <w:pPr>

</xml_diff>